<commit_message>
Word: add Table 5, the end-to-end pipeline for configurations A and B
Co-Authored-By: Claude Opus 5.5 <noreply@anthropic.com>
</commit_message>
<xml_diff>
--- a/docs/GSV_pipeline_report_20260928.docx
+++ b/docs/GSV_pipeline_report_20260928.docx
@@ -68,7 +68,7 @@
           <w:i/>
           <w:sz w:val="17"/>
         </w:rPr>
-        <w:t>⑤ End-to-end (사진 → 태그, 298장) — 배포 구성 A: OCR recall 64.5%, 태깅 recall 67.7%, 허위 POI 69/96. 단어 검출기만 YOLOv5x 로 바꾼 구성 B: OCR recall 62.8%, 태깅 recall 67.7%, 허위 POI 67/96. 가장 큰 손실은 간판 검출(놓친 간판 79개, 허위 간판 96개)입니다.</w:t>
+        <w:t>⑤ End-to-end (사진 → 태그, 298장) — 배포 구성 A: OCR recall 64.5%, 태깅 recall 67.7%, 허위 POI 69/96. 단어 검출기만 YOLOv5x 로 바꾼 구성 B: OCR recall 62.8%, 태깅 recall 67.7%, 허위 POI 67/96 (표 5). 가장 큰 손실은 간판 검출(놓친 간판 79개, 허위 간판 96개)입니다.</w:t>
       </w:r>
     </w:p>
     <w:p>
@@ -3759,10 +3759,9 @@
       <w:r>
         <w:rPr>
           <w:b/>
-          <w:i/>
-          <w:sz w:val="17"/>
+          <w:sz w:val="22"/>
         </w:rPr>
-        <w:t>연쇄(end-to-end) 결과 — 배포 구성 A</w:t>
+        <w:t>Table 5. End-to-end pipeline, configurations A and B: GSV photo → signboard detection → word detection → SVTRv2-B → Gemma 4 31B fix → Gemma 4 31B tagging (298 photos; line exact % / tagging accuracy %)</w:t>
       </w:r>
     </w:p>
     <w:p>
@@ -3772,9 +3771,1528 @@
           <w:i/>
           <w:sz w:val="17"/>
         </w:rPr>
-        <w:t>사진 한 장에서 시작해 간판 검출 → 단어 검출 → SVTRv2 → Gemma 4 fix → 태깅까지 한 번에 돌린 값입니다. 표 1·2 와 같은 GSV 사진 298장(정답 간판 453개)에서 잽니다. 간판 검출은 표 1 의 검출기의 out-of-fold 예측(conf 0.25)으로, 453개 중 374개를 찾고(TP) 79개를 놓쳤으며(FN) 간판이 아닌 것 96개를 간판으로 잘랐습니다(FP). “recall” 은 놓친 간판을 0점으로 분모에 넣은 값(배포 성능), “TP 위” 는 제대로 찾은 간판만 본 값, “GT crop” 은 같은 298장에서 사람이 그린 간판에 같은 모델을 돌린 값입니다. 채점기는 표 3·4 와 같습니다.</w:t>
+        <w:t>사진 한 장에서 시작해 간판 검출 → 단어 검출 → SVTRv2 → Gemma 4 fix → 태깅까지 한 번에 돌린 값입니다. 표 1·2 와 같은 GSV 사진 298장(정답 간판 453개)에서 잽니다. 간판 검출은 표 1 의 검출기의 out-of-fold 예측(conf 0.25)으로, 453개 중 374개를 찾고(TP) 79개를 놓쳤으며(FN) 간판이 아닌 것 96개를 간판으로 잘랐습니다(FP). “recall” 은 놓친 간판을 0점으로 분모에 넣은 값(배포 성능), “TP 위” 는 제대로 찾은 간판만 본 값, “GT crop” 은 같은 298장에서 사람이 그린 간판에 같은 모델을 돌린 값입니다. 채점기는 표 3·4 와 같습니다. 구성 A 와 B 는 단어 검출기만 다르고(YOLO26x / YOLOv5x), 간판 검출·인식기·VLM 은 같습니다. 두 구성은 같은 간판 검출 결과를 공유하므로 1단계 행은 하나입니다.</w:t>
       </w:r>
     </w:p>
+    <w:tbl>
+      <w:tblPr>
+        <w:tblStyle w:val="TableGrid"/>
+        <w:tblW w:type="auto" w:w="0"/>
+        <w:tblLook w:firstColumn="1" w:firstRow="1" w:lastColumn="0" w:lastRow="0" w:noHBand="0" w:noVBand="1" w:val="04A0"/>
+      </w:tblPr>
+      <w:tblGrid>
+        <w:gridCol w:w="1234"/>
+        <w:gridCol w:w="1234"/>
+        <w:gridCol w:w="1234"/>
+        <w:gridCol w:w="1234"/>
+        <w:gridCol w:w="1234"/>
+        <w:gridCol w:w="1234"/>
+        <w:gridCol w:w="1234"/>
+      </w:tblGrid>
+      <w:tr>
+        <w:tc>
+          <w:tcPr>
+            <w:tcW w:type="dxa" w:w="1234"/>
+          </w:tcPr>
+          <w:p>
+            <w:r>
+              <w:rPr>
+                <w:b/>
+                <w:sz w:val="17"/>
+              </w:rPr>
+              <w:t>Configuration</w:t>
+            </w:r>
+          </w:p>
+        </w:tc>
+        <w:tc>
+          <w:tcPr>
+            <w:tcW w:type="dxa" w:w="1234"/>
+          </w:tcPr>
+          <w:p>
+            <w:pPr>
+              <w:jc w:val="right"/>
+            </w:pPr>
+            <w:r>
+              <w:rPr>
+                <w:b/>
+                <w:sz w:val="17"/>
+              </w:rPr>
+              <w:t>Stage / metric</w:t>
+            </w:r>
+          </w:p>
+        </w:tc>
+        <w:tc>
+          <w:tcPr>
+            <w:tcW w:type="dxa" w:w="1234"/>
+          </w:tcPr>
+          <w:p>
+            <w:pPr>
+              <w:jc w:val="right"/>
+            </w:pPr>
+            <w:r>
+              <w:rPr>
+                <w:b/>
+                <w:sz w:val="17"/>
+              </w:rPr>
+              <w:t>Gangnam</w:t>
+            </w:r>
+          </w:p>
+        </w:tc>
+        <w:tc>
+          <w:tcPr>
+            <w:tcW w:type="dxa" w:w="1234"/>
+          </w:tcPr>
+          <w:p>
+            <w:pPr>
+              <w:jc w:val="right"/>
+            </w:pPr>
+            <w:r>
+              <w:rPr>
+                <w:b/>
+                <w:sz w:val="17"/>
+              </w:rPr>
+              <w:t>Brooklyn</w:t>
+            </w:r>
+          </w:p>
+        </w:tc>
+        <w:tc>
+          <w:tcPr>
+            <w:tcW w:type="dxa" w:w="1234"/>
+          </w:tcPr>
+          <w:p>
+            <w:pPr>
+              <w:jc w:val="right"/>
+            </w:pPr>
+            <w:r>
+              <w:rPr>
+                <w:b/>
+                <w:sz w:val="17"/>
+              </w:rPr>
+              <w:t>Suwon</w:t>
+            </w:r>
+          </w:p>
+        </w:tc>
+        <w:tc>
+          <w:tcPr>
+            <w:tcW w:type="dxa" w:w="1234"/>
+          </w:tcPr>
+          <w:p>
+            <w:pPr>
+              <w:jc w:val="right"/>
+            </w:pPr>
+            <w:r>
+              <w:rPr>
+                <w:b/>
+                <w:sz w:val="17"/>
+              </w:rPr>
+              <w:t>Overall</w:t>
+            </w:r>
+          </w:p>
+        </w:tc>
+        <w:tc>
+          <w:tcPr>
+            <w:tcW w:type="dxa" w:w="1234"/>
+          </w:tcPr>
+          <w:p>
+            <w:pPr>
+              <w:jc w:val="right"/>
+            </w:pPr>
+            <w:r>
+              <w:rPr>
+                <w:b/>
+                <w:sz w:val="17"/>
+              </w:rPr>
+              <w:t>Counted over (overall)</w:t>
+            </w:r>
+          </w:p>
+        </w:tc>
+      </w:tr>
+      <w:tr>
+        <w:tc>
+          <w:tcPr>
+            <w:tcW w:type="dxa" w:w="1234"/>
+          </w:tcPr>
+          <w:p>
+            <w:r>
+              <w:rPr>
+                <w:sz w:val="17"/>
+              </w:rPr>
+              <w:t>Shared stage 1</w:t>
+            </w:r>
+          </w:p>
+        </w:tc>
+        <w:tc>
+          <w:tcPr>
+            <w:tcW w:type="dxa" w:w="1234"/>
+          </w:tcPr>
+          <w:p>
+            <w:pPr>
+              <w:jc w:val="right"/>
+            </w:pPr>
+            <w:r>
+              <w:rPr>
+                <w:sz w:val="17"/>
+              </w:rPr>
+              <w:t>Signboard detection (YOLO26x, out-of-fold): TP / FN / FP at IoU ≥ 0.5</w:t>
+            </w:r>
+          </w:p>
+        </w:tc>
+        <w:tc>
+          <w:tcPr>
+            <w:tcW w:type="dxa" w:w="1234"/>
+          </w:tcPr>
+          <w:p>
+            <w:pPr>
+              <w:jc w:val="right"/>
+            </w:pPr>
+            <w:r>
+              <w:rPr>
+                <w:sz w:val="17"/>
+              </w:rPr>
+              <w:t>116 / 29 / 37</w:t>
+            </w:r>
+          </w:p>
+        </w:tc>
+        <w:tc>
+          <w:tcPr>
+            <w:tcW w:type="dxa" w:w="1234"/>
+          </w:tcPr>
+          <w:p>
+            <w:pPr>
+              <w:jc w:val="right"/>
+            </w:pPr>
+            <w:r>
+              <w:rPr>
+                <w:sz w:val="17"/>
+              </w:rPr>
+              <w:t>142 / 25 / 26</w:t>
+            </w:r>
+          </w:p>
+        </w:tc>
+        <w:tc>
+          <w:tcPr>
+            <w:tcW w:type="dxa" w:w="1234"/>
+          </w:tcPr>
+          <w:p>
+            <w:pPr>
+              <w:jc w:val="right"/>
+            </w:pPr>
+            <w:r>
+              <w:rPr>
+                <w:sz w:val="17"/>
+              </w:rPr>
+              <w:t>116 / 25 / 33</w:t>
+            </w:r>
+          </w:p>
+        </w:tc>
+        <w:tc>
+          <w:tcPr>
+            <w:tcW w:type="dxa" w:w="1234"/>
+          </w:tcPr>
+          <w:p>
+            <w:pPr>
+              <w:jc w:val="right"/>
+            </w:pPr>
+            <w:r>
+              <w:rPr>
+                <w:sz w:val="17"/>
+              </w:rPr>
+              <w:t>374 / 79 / 96</w:t>
+            </w:r>
+          </w:p>
+        </w:tc>
+        <w:tc>
+          <w:tcPr>
+            <w:tcW w:type="dxa" w:w="1234"/>
+          </w:tcPr>
+          <w:p>
+            <w:pPr>
+              <w:jc w:val="right"/>
+            </w:pPr>
+            <w:r>
+              <w:rPr>
+                <w:sz w:val="17"/>
+              </w:rPr>
+              <w:t>453 GT signboards, 298 photos</w:t>
+            </w:r>
+          </w:p>
+        </w:tc>
+      </w:tr>
+      <w:tr>
+        <w:tc>
+          <w:tcPr>
+            <w:tcW w:type="dxa" w:w="1234"/>
+            <w:vMerge w:val="restart"/>
+          </w:tcPr>
+          <w:p>
+            <w:r>
+              <w:rPr>
+                <w:sz w:val="17"/>
+              </w:rPr>
+              <w:t>A (deployed): YOLO26x word detector</w:t>
+            </w:r>
+          </w:p>
+        </w:tc>
+        <w:tc>
+          <w:tcPr>
+            <w:tcW w:type="dxa" w:w="1234"/>
+          </w:tcPr>
+          <w:p>
+            <w:pPr>
+              <w:jc w:val="right"/>
+            </w:pPr>
+            <w:r>
+              <w:rPr>
+                <w:sz w:val="17"/>
+              </w:rPr>
+              <w:t>OCR line exact — pipeline (missed signboards scored as wrong)</w:t>
+            </w:r>
+          </w:p>
+        </w:tc>
+        <w:tc>
+          <w:tcPr>
+            <w:tcW w:type="dxa" w:w="1234"/>
+          </w:tcPr>
+          <w:p>
+            <w:pPr>
+              <w:jc w:val="right"/>
+            </w:pPr>
+            <w:r>
+              <w:rPr>
+                <w:sz w:val="17"/>
+              </w:rPr>
+              <w:t>63.6</w:t>
+            </w:r>
+          </w:p>
+        </w:tc>
+        <w:tc>
+          <w:tcPr>
+            <w:tcW w:type="dxa" w:w="1234"/>
+          </w:tcPr>
+          <w:p>
+            <w:pPr>
+              <w:jc w:val="right"/>
+            </w:pPr>
+            <w:r>
+              <w:rPr>
+                <w:sz w:val="17"/>
+              </w:rPr>
+              <w:t>67.0</w:t>
+            </w:r>
+          </w:p>
+        </w:tc>
+        <w:tc>
+          <w:tcPr>
+            <w:tcW w:type="dxa" w:w="1234"/>
+          </w:tcPr>
+          <w:p>
+            <w:pPr>
+              <w:jc w:val="right"/>
+            </w:pPr>
+            <w:r>
+              <w:rPr>
+                <w:sz w:val="17"/>
+              </w:rPr>
+              <w:t>63.0</w:t>
+            </w:r>
+          </w:p>
+        </w:tc>
+        <w:tc>
+          <w:tcPr>
+            <w:tcW w:type="dxa" w:w="1234"/>
+          </w:tcPr>
+          <w:p>
+            <w:pPr>
+              <w:jc w:val="right"/>
+            </w:pPr>
+            <w:r>
+              <w:rPr>
+                <w:sz w:val="17"/>
+              </w:rPr>
+              <w:t>64.5%</w:t>
+            </w:r>
+          </w:p>
+        </w:tc>
+        <w:tc>
+          <w:tcPr>
+            <w:tcW w:type="dxa" w:w="1234"/>
+          </w:tcPr>
+          <w:p>
+            <w:pPr>
+              <w:jc w:val="right"/>
+            </w:pPr>
+            <w:r>
+              <w:rPr>
+                <w:sz w:val="17"/>
+              </w:rPr>
+              <w:t>581 GT lines</w:t>
+            </w:r>
+          </w:p>
+        </w:tc>
+      </w:tr>
+      <w:tr>
+        <w:tc>
+          <w:tcPr>
+            <w:tcW w:type="dxa" w:w="1234"/>
+            <w:vMerge/>
+          </w:tcPr>
+          <w:p/>
+        </w:tc>
+        <w:tc>
+          <w:tcPr>
+            <w:tcW w:type="dxa" w:w="1234"/>
+          </w:tcPr>
+          <w:p>
+            <w:pPr>
+              <w:jc w:val="right"/>
+            </w:pPr>
+            <w:r>
+              <w:rPr>
+                <w:sz w:val="17"/>
+              </w:rPr>
+              <w:t>OCR line exact — on correctly detected signboards (TP)</w:t>
+            </w:r>
+          </w:p>
+        </w:tc>
+        <w:tc>
+          <w:tcPr>
+            <w:tcW w:type="dxa" w:w="1234"/>
+          </w:tcPr>
+          <w:p>
+            <w:pPr>
+              <w:jc w:val="right"/>
+            </w:pPr>
+            <w:r>
+              <w:rPr>
+                <w:sz w:val="17"/>
+              </w:rPr>
+              <w:t>77.1</w:t>
+            </w:r>
+          </w:p>
+        </w:tc>
+        <w:tc>
+          <w:tcPr>
+            <w:tcW w:type="dxa" w:w="1234"/>
+          </w:tcPr>
+          <w:p>
+            <w:pPr>
+              <w:jc w:val="right"/>
+            </w:pPr>
+            <w:r>
+              <w:rPr>
+                <w:sz w:val="17"/>
+              </w:rPr>
+              <w:t>76.5</w:t>
+            </w:r>
+          </w:p>
+        </w:tc>
+        <w:tc>
+          <w:tcPr>
+            <w:tcW w:type="dxa" w:w="1234"/>
+          </w:tcPr>
+          <w:p>
+            <w:pPr>
+              <w:jc w:val="right"/>
+            </w:pPr>
+            <w:r>
+              <w:rPr>
+                <w:sz w:val="17"/>
+              </w:rPr>
+              <w:t>78.1</w:t>
+            </w:r>
+          </w:p>
+        </w:tc>
+        <w:tc>
+          <w:tcPr>
+            <w:tcW w:type="dxa" w:w="1234"/>
+          </w:tcPr>
+          <w:p>
+            <w:pPr>
+              <w:jc w:val="right"/>
+            </w:pPr>
+            <w:r>
+              <w:rPr>
+                <w:sz w:val="17"/>
+              </w:rPr>
+              <w:t>77.2%</w:t>
+            </w:r>
+          </w:p>
+        </w:tc>
+        <w:tc>
+          <w:tcPr>
+            <w:tcW w:type="dxa" w:w="1234"/>
+          </w:tcPr>
+          <w:p>
+            <w:pPr>
+              <w:jc w:val="right"/>
+            </w:pPr>
+            <w:r>
+              <w:rPr>
+                <w:sz w:val="17"/>
+              </w:rPr>
+              <w:t>lines of the 374 TP signboards</w:t>
+            </w:r>
+          </w:p>
+        </w:tc>
+      </w:tr>
+      <w:tr>
+        <w:tc>
+          <w:tcPr>
+            <w:tcW w:type="dxa" w:w="1234"/>
+            <w:vMerge/>
+          </w:tcPr>
+          <w:p/>
+        </w:tc>
+        <w:tc>
+          <w:tcPr>
+            <w:tcW w:type="dxa" w:w="1234"/>
+          </w:tcPr>
+          <w:p>
+            <w:pPr>
+              <w:jc w:val="right"/>
+            </w:pPr>
+            <w:r>
+              <w:rPr>
+                <w:sz w:val="17"/>
+              </w:rPr>
+              <w:t>OCR line exact — on GT signboards (detection perfect)</w:t>
+            </w:r>
+          </w:p>
+        </w:tc>
+        <w:tc>
+          <w:tcPr>
+            <w:tcW w:type="dxa" w:w="1234"/>
+          </w:tcPr>
+          <w:p>
+            <w:pPr>
+              <w:jc w:val="right"/>
+            </w:pPr>
+            <w:r>
+              <w:rPr>
+                <w:sz w:val="17"/>
+              </w:rPr>
+              <w:t>83.0</w:t>
+            </w:r>
+          </w:p>
+        </w:tc>
+        <w:tc>
+          <w:tcPr>
+            <w:tcW w:type="dxa" w:w="1234"/>
+          </w:tcPr>
+          <w:p>
+            <w:pPr>
+              <w:jc w:val="right"/>
+            </w:pPr>
+            <w:r>
+              <w:rPr>
+                <w:sz w:val="17"/>
+              </w:rPr>
+              <w:t>88.7</w:t>
+            </w:r>
+          </w:p>
+        </w:tc>
+        <w:tc>
+          <w:tcPr>
+            <w:tcW w:type="dxa" w:w="1234"/>
+          </w:tcPr>
+          <w:p>
+            <w:pPr>
+              <w:jc w:val="right"/>
+            </w:pPr>
+            <w:r>
+              <w:rPr>
+                <w:sz w:val="17"/>
+              </w:rPr>
+              <w:t>79.0</w:t>
+            </w:r>
+          </w:p>
+        </w:tc>
+        <w:tc>
+          <w:tcPr>
+            <w:tcW w:type="dxa" w:w="1234"/>
+          </w:tcPr>
+          <w:p>
+            <w:pPr>
+              <w:jc w:val="right"/>
+            </w:pPr>
+            <w:r>
+              <w:rPr>
+                <w:sz w:val="17"/>
+              </w:rPr>
+              <w:t>83.6%</w:t>
+            </w:r>
+          </w:p>
+        </w:tc>
+        <w:tc>
+          <w:tcPr>
+            <w:tcW w:type="dxa" w:w="1234"/>
+          </w:tcPr>
+          <w:p>
+            <w:pPr>
+              <w:jc w:val="right"/>
+            </w:pPr>
+            <w:r>
+              <w:rPr>
+                <w:sz w:val="17"/>
+              </w:rPr>
+              <w:t>581 GT lines</w:t>
+            </w:r>
+          </w:p>
+        </w:tc>
+      </w:tr>
+      <w:tr>
+        <w:tc>
+          <w:tcPr>
+            <w:tcW w:type="dxa" w:w="1234"/>
+            <w:vMerge/>
+          </w:tcPr>
+          <w:p/>
+        </w:tc>
+        <w:tc>
+          <w:tcPr>
+            <w:tcW w:type="dxa" w:w="1234"/>
+          </w:tcPr>
+          <w:p>
+            <w:pPr>
+              <w:jc w:val="right"/>
+            </w:pPr>
+            <w:r>
+              <w:rPr>
+                <w:sz w:val="17"/>
+              </w:rPr>
+              <w:t>Tagging accuracy — pipeline (missed signboards scored as wrong)</w:t>
+            </w:r>
+          </w:p>
+        </w:tc>
+        <w:tc>
+          <w:tcPr>
+            <w:tcW w:type="dxa" w:w="1234"/>
+          </w:tcPr>
+          <w:p>
+            <w:pPr>
+              <w:jc w:val="right"/>
+            </w:pPr>
+            <w:r>
+              <w:rPr>
+                <w:sz w:val="17"/>
+              </w:rPr>
+              <w:t>72.0</w:t>
+            </w:r>
+          </w:p>
+        </w:tc>
+        <w:tc>
+          <w:tcPr>
+            <w:tcW w:type="dxa" w:w="1234"/>
+          </w:tcPr>
+          <w:p>
+            <w:pPr>
+              <w:jc w:val="right"/>
+            </w:pPr>
+            <w:r>
+              <w:rPr>
+                <w:sz w:val="17"/>
+              </w:rPr>
+              <w:t>61.7</w:t>
+            </w:r>
+          </w:p>
+        </w:tc>
+        <w:tc>
+          <w:tcPr>
+            <w:tcW w:type="dxa" w:w="1234"/>
+          </w:tcPr>
+          <w:p>
+            <w:pPr>
+              <w:jc w:val="right"/>
+            </w:pPr>
+            <w:r>
+              <w:rPr>
+                <w:sz w:val="17"/>
+              </w:rPr>
+              <w:t>69.3</w:t>
+            </w:r>
+          </w:p>
+        </w:tc>
+        <w:tc>
+          <w:tcPr>
+            <w:tcW w:type="dxa" w:w="1234"/>
+          </w:tcPr>
+          <w:p>
+            <w:pPr>
+              <w:jc w:val="right"/>
+            </w:pPr>
+            <w:r>
+              <w:rPr>
+                <w:sz w:val="17"/>
+              </w:rPr>
+              <w:t>67.7%</w:t>
+            </w:r>
+          </w:p>
+        </w:tc>
+        <w:tc>
+          <w:tcPr>
+            <w:tcW w:type="dxa" w:w="1234"/>
+          </w:tcPr>
+          <w:p>
+            <w:pPr>
+              <w:jc w:val="right"/>
+            </w:pPr>
+            <w:r>
+              <w:rPr>
+                <w:sz w:val="17"/>
+              </w:rPr>
+              <w:t>387 tagging targets</w:t>
+            </w:r>
+          </w:p>
+        </w:tc>
+      </w:tr>
+      <w:tr>
+        <w:tc>
+          <w:tcPr>
+            <w:tcW w:type="dxa" w:w="1234"/>
+            <w:vMerge/>
+          </w:tcPr>
+          <w:p/>
+        </w:tc>
+        <w:tc>
+          <w:tcPr>
+            <w:tcW w:type="dxa" w:w="1234"/>
+          </w:tcPr>
+          <w:p>
+            <w:pPr>
+              <w:jc w:val="right"/>
+            </w:pPr>
+            <w:r>
+              <w:rPr>
+                <w:sz w:val="17"/>
+              </w:rPr>
+              <w:t>Tagging accuracy — on correctly detected signboards (TP)</w:t>
+            </w:r>
+          </w:p>
+        </w:tc>
+        <w:tc>
+          <w:tcPr>
+            <w:tcW w:type="dxa" w:w="1234"/>
+          </w:tcPr>
+          <w:p>
+            <w:pPr>
+              <w:jc w:val="right"/>
+            </w:pPr>
+            <w:r>
+              <w:rPr>
+                <w:sz w:val="17"/>
+              </w:rPr>
+              <w:t>87.2</w:t>
+            </w:r>
+          </w:p>
+        </w:tc>
+        <w:tc>
+          <w:tcPr>
+            <w:tcW w:type="dxa" w:w="1234"/>
+          </w:tcPr>
+          <w:p>
+            <w:pPr>
+              <w:jc w:val="right"/>
+            </w:pPr>
+            <w:r>
+              <w:rPr>
+                <w:sz w:val="17"/>
+              </w:rPr>
+              <w:t>70.5</w:t>
+            </w:r>
+          </w:p>
+        </w:tc>
+        <w:tc>
+          <w:tcPr>
+            <w:tcW w:type="dxa" w:w="1234"/>
+          </w:tcPr>
+          <w:p>
+            <w:pPr>
+              <w:jc w:val="right"/>
+            </w:pPr>
+            <w:r>
+              <w:rPr>
+                <w:sz w:val="17"/>
+              </w:rPr>
+              <w:t>84.6</w:t>
+            </w:r>
+          </w:p>
+        </w:tc>
+        <w:tc>
+          <w:tcPr>
+            <w:tcW w:type="dxa" w:w="1234"/>
+          </w:tcPr>
+          <w:p>
+            <w:pPr>
+              <w:jc w:val="right"/>
+            </w:pPr>
+            <w:r>
+              <w:rPr>
+                <w:sz w:val="17"/>
+              </w:rPr>
+              <w:t>80.6%</w:t>
+            </w:r>
+          </w:p>
+        </w:tc>
+        <w:tc>
+          <w:tcPr>
+            <w:tcW w:type="dxa" w:w="1234"/>
+          </w:tcPr>
+          <w:p>
+            <w:pPr>
+              <w:jc w:val="right"/>
+            </w:pPr>
+            <w:r>
+              <w:rPr>
+                <w:sz w:val="17"/>
+              </w:rPr>
+              <w:t>tagging targets among TP</w:t>
+            </w:r>
+          </w:p>
+        </w:tc>
+      </w:tr>
+      <w:tr>
+        <w:tc>
+          <w:tcPr>
+            <w:tcW w:type="dxa" w:w="1234"/>
+            <w:vMerge/>
+          </w:tcPr>
+          <w:p/>
+        </w:tc>
+        <w:tc>
+          <w:tcPr>
+            <w:tcW w:type="dxa" w:w="1234"/>
+          </w:tcPr>
+          <w:p>
+            <w:pPr>
+              <w:jc w:val="right"/>
+            </w:pPr>
+            <w:r>
+              <w:rPr>
+                <w:sz w:val="17"/>
+              </w:rPr>
+              <w:t>False POI — non-signboard crops (FP) that received a business tag</w:t>
+            </w:r>
+          </w:p>
+        </w:tc>
+        <w:tc>
+          <w:tcPr>
+            <w:tcW w:type="dxa" w:w="1234"/>
+          </w:tcPr>
+          <w:p>
+            <w:pPr>
+              <w:jc w:val="right"/>
+            </w:pPr>
+            <w:r>
+              <w:rPr>
+                <w:sz w:val="17"/>
+              </w:rPr>
+              <w:t>26 / 37</w:t>
+            </w:r>
+          </w:p>
+        </w:tc>
+        <w:tc>
+          <w:tcPr>
+            <w:tcW w:type="dxa" w:w="1234"/>
+          </w:tcPr>
+          <w:p>
+            <w:pPr>
+              <w:jc w:val="right"/>
+            </w:pPr>
+            <w:r>
+              <w:rPr>
+                <w:sz w:val="17"/>
+              </w:rPr>
+              <w:t>19 / 26</w:t>
+            </w:r>
+          </w:p>
+        </w:tc>
+        <w:tc>
+          <w:tcPr>
+            <w:tcW w:type="dxa" w:w="1234"/>
+          </w:tcPr>
+          <w:p>
+            <w:pPr>
+              <w:jc w:val="right"/>
+            </w:pPr>
+            <w:r>
+              <w:rPr>
+                <w:sz w:val="17"/>
+              </w:rPr>
+              <w:t>24 / 33</w:t>
+            </w:r>
+          </w:p>
+        </w:tc>
+        <w:tc>
+          <w:tcPr>
+            <w:tcW w:type="dxa" w:w="1234"/>
+          </w:tcPr>
+          <w:p>
+            <w:pPr>
+              <w:jc w:val="right"/>
+            </w:pPr>
+            <w:r>
+              <w:rPr>
+                <w:sz w:val="17"/>
+              </w:rPr>
+              <w:t>69 / 96</w:t>
+            </w:r>
+          </w:p>
+        </w:tc>
+        <w:tc>
+          <w:tcPr>
+            <w:tcW w:type="dxa" w:w="1234"/>
+          </w:tcPr>
+          <w:p>
+            <w:pPr>
+              <w:jc w:val="right"/>
+            </w:pPr>
+            <w:r>
+              <w:rPr>
+                <w:sz w:val="17"/>
+              </w:rPr>
+              <w:t>96 FP crops</w:t>
+            </w:r>
+          </w:p>
+        </w:tc>
+      </w:tr>
+      <w:tr>
+        <w:tc>
+          <w:tcPr>
+            <w:tcW w:type="dxa" w:w="1234"/>
+            <w:vMerge w:val="restart"/>
+          </w:tcPr>
+          <w:p>
+            <w:r>
+              <w:rPr>
+                <w:sz w:val="17"/>
+              </w:rPr>
+              <w:t>B: YOLOv5x word detector</w:t>
+            </w:r>
+          </w:p>
+        </w:tc>
+        <w:tc>
+          <w:tcPr>
+            <w:tcW w:type="dxa" w:w="1234"/>
+          </w:tcPr>
+          <w:p>
+            <w:pPr>
+              <w:jc w:val="right"/>
+            </w:pPr>
+            <w:r>
+              <w:rPr>
+                <w:sz w:val="17"/>
+              </w:rPr>
+              <w:t>OCR line exact — pipeline (missed signboards scored as wrong)</w:t>
+            </w:r>
+          </w:p>
+        </w:tc>
+        <w:tc>
+          <w:tcPr>
+            <w:tcW w:type="dxa" w:w="1234"/>
+          </w:tcPr>
+          <w:p>
+            <w:pPr>
+              <w:jc w:val="right"/>
+            </w:pPr>
+            <w:r>
+              <w:rPr>
+                <w:sz w:val="17"/>
+              </w:rPr>
+              <w:t>62.6</w:t>
+            </w:r>
+          </w:p>
+        </w:tc>
+        <w:tc>
+          <w:tcPr>
+            <w:tcW w:type="dxa" w:w="1234"/>
+          </w:tcPr>
+          <w:p>
+            <w:pPr>
+              <w:jc w:val="right"/>
+            </w:pPr>
+            <w:r>
+              <w:rPr>
+                <w:sz w:val="17"/>
+              </w:rPr>
+              <w:t>64.9</w:t>
+            </w:r>
+          </w:p>
+        </w:tc>
+        <w:tc>
+          <w:tcPr>
+            <w:tcW w:type="dxa" w:w="1234"/>
+          </w:tcPr>
+          <w:p>
+            <w:pPr>
+              <w:jc w:val="right"/>
+            </w:pPr>
+            <w:r>
+              <w:rPr>
+                <w:sz w:val="17"/>
+              </w:rPr>
+              <w:t>60.8</w:t>
+            </w:r>
+          </w:p>
+        </w:tc>
+        <w:tc>
+          <w:tcPr>
+            <w:tcW w:type="dxa" w:w="1234"/>
+          </w:tcPr>
+          <w:p>
+            <w:pPr>
+              <w:jc w:val="right"/>
+            </w:pPr>
+            <w:r>
+              <w:rPr>
+                <w:sz w:val="17"/>
+              </w:rPr>
+              <w:t>62.8%</w:t>
+            </w:r>
+          </w:p>
+        </w:tc>
+        <w:tc>
+          <w:tcPr>
+            <w:tcW w:type="dxa" w:w="1234"/>
+          </w:tcPr>
+          <w:p>
+            <w:pPr>
+              <w:jc w:val="right"/>
+            </w:pPr>
+            <w:r>
+              <w:rPr>
+                <w:sz w:val="17"/>
+              </w:rPr>
+              <w:t>581 GT lines</w:t>
+            </w:r>
+          </w:p>
+        </w:tc>
+      </w:tr>
+      <w:tr>
+        <w:tc>
+          <w:tcPr>
+            <w:tcW w:type="dxa" w:w="1234"/>
+            <w:vMerge/>
+          </w:tcPr>
+          <w:p/>
+        </w:tc>
+        <w:tc>
+          <w:tcPr>
+            <w:tcW w:type="dxa" w:w="1234"/>
+          </w:tcPr>
+          <w:p>
+            <w:pPr>
+              <w:jc w:val="right"/>
+            </w:pPr>
+            <w:r>
+              <w:rPr>
+                <w:sz w:val="17"/>
+              </w:rPr>
+              <w:t>OCR line exact — on correctly detected signboards (TP)</w:t>
+            </w:r>
+          </w:p>
+        </w:tc>
+        <w:tc>
+          <w:tcPr>
+            <w:tcW w:type="dxa" w:w="1234"/>
+          </w:tcPr>
+          <w:p>
+            <w:pPr>
+              <w:jc w:val="right"/>
+            </w:pPr>
+            <w:r>
+              <w:rPr>
+                <w:sz w:val="17"/>
+              </w:rPr>
+              <w:t>75.9</w:t>
+            </w:r>
+          </w:p>
+        </w:tc>
+        <w:tc>
+          <w:tcPr>
+            <w:tcW w:type="dxa" w:w="1234"/>
+          </w:tcPr>
+          <w:p>
+            <w:pPr>
+              <w:jc w:val="right"/>
+            </w:pPr>
+            <w:r>
+              <w:rPr>
+                <w:sz w:val="17"/>
+              </w:rPr>
+              <w:t>74.1</w:t>
+            </w:r>
+          </w:p>
+        </w:tc>
+        <w:tc>
+          <w:tcPr>
+            <w:tcW w:type="dxa" w:w="1234"/>
+          </w:tcPr>
+          <w:p>
+            <w:pPr>
+              <w:jc w:val="right"/>
+            </w:pPr>
+            <w:r>
+              <w:rPr>
+                <w:sz w:val="17"/>
+              </w:rPr>
+              <w:t>75.3</w:t>
+            </w:r>
+          </w:p>
+        </w:tc>
+        <w:tc>
+          <w:tcPr>
+            <w:tcW w:type="dxa" w:w="1234"/>
+          </w:tcPr>
+          <w:p>
+            <w:pPr>
+              <w:jc w:val="right"/>
+            </w:pPr>
+            <w:r>
+              <w:rPr>
+                <w:sz w:val="17"/>
+              </w:rPr>
+              <w:t>75.1%</w:t>
+            </w:r>
+          </w:p>
+        </w:tc>
+        <w:tc>
+          <w:tcPr>
+            <w:tcW w:type="dxa" w:w="1234"/>
+          </w:tcPr>
+          <w:p>
+            <w:pPr>
+              <w:jc w:val="right"/>
+            </w:pPr>
+            <w:r>
+              <w:rPr>
+                <w:sz w:val="17"/>
+              </w:rPr>
+              <w:t>lines of the 374 TP signboards</w:t>
+            </w:r>
+          </w:p>
+        </w:tc>
+      </w:tr>
+      <w:tr>
+        <w:tc>
+          <w:tcPr>
+            <w:tcW w:type="dxa" w:w="1234"/>
+            <w:vMerge/>
+          </w:tcPr>
+          <w:p/>
+        </w:tc>
+        <w:tc>
+          <w:tcPr>
+            <w:tcW w:type="dxa" w:w="1234"/>
+          </w:tcPr>
+          <w:p>
+            <w:pPr>
+              <w:jc w:val="right"/>
+            </w:pPr>
+            <w:r>
+              <w:rPr>
+                <w:sz w:val="17"/>
+              </w:rPr>
+              <w:t>OCR line exact — on GT signboards (detection perfect)</w:t>
+            </w:r>
+          </w:p>
+        </w:tc>
+        <w:tc>
+          <w:tcPr>
+            <w:tcW w:type="dxa" w:w="1234"/>
+          </w:tcPr>
+          <w:p>
+            <w:pPr>
+              <w:jc w:val="right"/>
+            </w:pPr>
+            <w:r>
+              <w:rPr>
+                <w:sz w:val="17"/>
+              </w:rPr>
+              <w:t>83.5</w:t>
+            </w:r>
+          </w:p>
+        </w:tc>
+        <w:tc>
+          <w:tcPr>
+            <w:tcW w:type="dxa" w:w="1234"/>
+          </w:tcPr>
+          <w:p>
+            <w:pPr>
+              <w:jc w:val="right"/>
+            </w:pPr>
+            <w:r>
+              <w:rPr>
+                <w:sz w:val="17"/>
+              </w:rPr>
+              <w:t>85.6</w:t>
+            </w:r>
+          </w:p>
+        </w:tc>
+        <w:tc>
+          <w:tcPr>
+            <w:tcW w:type="dxa" w:w="1234"/>
+          </w:tcPr>
+          <w:p>
+            <w:pPr>
+              <w:jc w:val="right"/>
+            </w:pPr>
+            <w:r>
+              <w:rPr>
+                <w:sz w:val="17"/>
+              </w:rPr>
+              <w:t>77.9</w:t>
+            </w:r>
+          </w:p>
+        </w:tc>
+        <w:tc>
+          <w:tcPr>
+            <w:tcW w:type="dxa" w:w="1234"/>
+          </w:tcPr>
+          <w:p>
+            <w:pPr>
+              <w:jc w:val="right"/>
+            </w:pPr>
+            <w:r>
+              <w:rPr>
+                <w:sz w:val="17"/>
+              </w:rPr>
+              <w:t>82.4%</w:t>
+            </w:r>
+          </w:p>
+        </w:tc>
+        <w:tc>
+          <w:tcPr>
+            <w:tcW w:type="dxa" w:w="1234"/>
+          </w:tcPr>
+          <w:p>
+            <w:pPr>
+              <w:jc w:val="right"/>
+            </w:pPr>
+            <w:r>
+              <w:rPr>
+                <w:sz w:val="17"/>
+              </w:rPr>
+              <w:t>581 GT lines</w:t>
+            </w:r>
+          </w:p>
+        </w:tc>
+      </w:tr>
+      <w:tr>
+        <w:tc>
+          <w:tcPr>
+            <w:tcW w:type="dxa" w:w="1234"/>
+            <w:vMerge/>
+          </w:tcPr>
+          <w:p/>
+        </w:tc>
+        <w:tc>
+          <w:tcPr>
+            <w:tcW w:type="dxa" w:w="1234"/>
+          </w:tcPr>
+          <w:p>
+            <w:pPr>
+              <w:jc w:val="right"/>
+            </w:pPr>
+            <w:r>
+              <w:rPr>
+                <w:sz w:val="17"/>
+              </w:rPr>
+              <w:t>Tagging accuracy — pipeline (missed signboards scored as wrong)</w:t>
+            </w:r>
+          </w:p>
+        </w:tc>
+        <w:tc>
+          <w:tcPr>
+            <w:tcW w:type="dxa" w:w="1234"/>
+          </w:tcPr>
+          <w:p>
+            <w:pPr>
+              <w:jc w:val="right"/>
+            </w:pPr>
+            <w:r>
+              <w:rPr>
+                <w:sz w:val="17"/>
+              </w:rPr>
+              <w:t>71.2</w:t>
+            </w:r>
+          </w:p>
+        </w:tc>
+        <w:tc>
+          <w:tcPr>
+            <w:tcW w:type="dxa" w:w="1234"/>
+          </w:tcPr>
+          <w:p>
+            <w:pPr>
+              <w:jc w:val="right"/>
+            </w:pPr>
+            <w:r>
+              <w:rPr>
+                <w:sz w:val="17"/>
+              </w:rPr>
+              <w:t>60.9</w:t>
+            </w:r>
+          </w:p>
+        </w:tc>
+        <w:tc>
+          <w:tcPr>
+            <w:tcW w:type="dxa" w:w="1234"/>
+          </w:tcPr>
+          <w:p>
+            <w:pPr>
+              <w:jc w:val="right"/>
+            </w:pPr>
+            <w:r>
+              <w:rPr>
+                <w:sz w:val="17"/>
+              </w:rPr>
+              <w:t>70.9</w:t>
+            </w:r>
+          </w:p>
+        </w:tc>
+        <w:tc>
+          <w:tcPr>
+            <w:tcW w:type="dxa" w:w="1234"/>
+          </w:tcPr>
+          <w:p>
+            <w:pPr>
+              <w:jc w:val="right"/>
+            </w:pPr>
+            <w:r>
+              <w:rPr>
+                <w:sz w:val="17"/>
+              </w:rPr>
+              <w:t>67.7%</w:t>
+            </w:r>
+          </w:p>
+        </w:tc>
+        <w:tc>
+          <w:tcPr>
+            <w:tcW w:type="dxa" w:w="1234"/>
+          </w:tcPr>
+          <w:p>
+            <w:pPr>
+              <w:jc w:val="right"/>
+            </w:pPr>
+            <w:r>
+              <w:rPr>
+                <w:sz w:val="17"/>
+              </w:rPr>
+              <w:t>387 tagging targets</w:t>
+            </w:r>
+          </w:p>
+        </w:tc>
+      </w:tr>
+      <w:tr>
+        <w:tc>
+          <w:tcPr>
+            <w:tcW w:type="dxa" w:w="1234"/>
+            <w:vMerge/>
+          </w:tcPr>
+          <w:p/>
+        </w:tc>
+        <w:tc>
+          <w:tcPr>
+            <w:tcW w:type="dxa" w:w="1234"/>
+          </w:tcPr>
+          <w:p>
+            <w:pPr>
+              <w:jc w:val="right"/>
+            </w:pPr>
+            <w:r>
+              <w:rPr>
+                <w:sz w:val="17"/>
+              </w:rPr>
+              <w:t>Tagging accuracy — on correctly detected signboards (TP)</w:t>
+            </w:r>
+          </w:p>
+        </w:tc>
+        <w:tc>
+          <w:tcPr>
+            <w:tcW w:type="dxa" w:w="1234"/>
+          </w:tcPr>
+          <w:p>
+            <w:pPr>
+              <w:jc w:val="right"/>
+            </w:pPr>
+            <w:r>
+              <w:rPr>
+                <w:sz w:val="17"/>
+              </w:rPr>
+              <w:t>86.2</w:t>
+            </w:r>
+          </w:p>
+        </w:tc>
+        <w:tc>
+          <w:tcPr>
+            <w:tcW w:type="dxa" w:w="1234"/>
+          </w:tcPr>
+          <w:p>
+            <w:pPr>
+              <w:jc w:val="right"/>
+            </w:pPr>
+            <w:r>
+              <w:rPr>
+                <w:sz w:val="17"/>
+              </w:rPr>
+              <w:t>69.6</w:t>
+            </w:r>
+          </w:p>
+        </w:tc>
+        <w:tc>
+          <w:tcPr>
+            <w:tcW w:type="dxa" w:w="1234"/>
+          </w:tcPr>
+          <w:p>
+            <w:pPr>
+              <w:jc w:val="right"/>
+            </w:pPr>
+            <w:r>
+              <w:rPr>
+                <w:sz w:val="17"/>
+              </w:rPr>
+              <w:t>86.5</w:t>
+            </w:r>
+          </w:p>
+        </w:tc>
+        <w:tc>
+          <w:tcPr>
+            <w:tcW w:type="dxa" w:w="1234"/>
+          </w:tcPr>
+          <w:p>
+            <w:pPr>
+              <w:jc w:val="right"/>
+            </w:pPr>
+            <w:r>
+              <w:rPr>
+                <w:sz w:val="17"/>
+              </w:rPr>
+              <w:t>80.6%</w:t>
+            </w:r>
+          </w:p>
+        </w:tc>
+        <w:tc>
+          <w:tcPr>
+            <w:tcW w:type="dxa" w:w="1234"/>
+          </w:tcPr>
+          <w:p>
+            <w:pPr>
+              <w:jc w:val="right"/>
+            </w:pPr>
+            <w:r>
+              <w:rPr>
+                <w:sz w:val="17"/>
+              </w:rPr>
+              <w:t>tagging targets among TP</w:t>
+            </w:r>
+          </w:p>
+        </w:tc>
+      </w:tr>
+      <w:tr>
+        <w:tc>
+          <w:tcPr>
+            <w:tcW w:type="dxa" w:w="1234"/>
+            <w:vMerge/>
+          </w:tcPr>
+          <w:p/>
+        </w:tc>
+        <w:tc>
+          <w:tcPr>
+            <w:tcW w:type="dxa" w:w="1234"/>
+          </w:tcPr>
+          <w:p>
+            <w:pPr>
+              <w:jc w:val="right"/>
+            </w:pPr>
+            <w:r>
+              <w:rPr>
+                <w:sz w:val="17"/>
+              </w:rPr>
+              <w:t>False POI — non-signboard crops (FP) that received a business tag</w:t>
+            </w:r>
+          </w:p>
+        </w:tc>
+        <w:tc>
+          <w:tcPr>
+            <w:tcW w:type="dxa" w:w="1234"/>
+          </w:tcPr>
+          <w:p>
+            <w:pPr>
+              <w:jc w:val="right"/>
+            </w:pPr>
+            <w:r>
+              <w:rPr>
+                <w:sz w:val="17"/>
+              </w:rPr>
+              <w:t>29 / 37</w:t>
+            </w:r>
+          </w:p>
+        </w:tc>
+        <w:tc>
+          <w:tcPr>
+            <w:tcW w:type="dxa" w:w="1234"/>
+          </w:tcPr>
+          <w:p>
+            <w:pPr>
+              <w:jc w:val="right"/>
+            </w:pPr>
+            <w:r>
+              <w:rPr>
+                <w:sz w:val="17"/>
+              </w:rPr>
+              <w:t>18 / 26</w:t>
+            </w:r>
+          </w:p>
+        </w:tc>
+        <w:tc>
+          <w:tcPr>
+            <w:tcW w:type="dxa" w:w="1234"/>
+          </w:tcPr>
+          <w:p>
+            <w:pPr>
+              <w:jc w:val="right"/>
+            </w:pPr>
+            <w:r>
+              <w:rPr>
+                <w:sz w:val="17"/>
+              </w:rPr>
+              <w:t>20 / 33</w:t>
+            </w:r>
+          </w:p>
+        </w:tc>
+        <w:tc>
+          <w:tcPr>
+            <w:tcW w:type="dxa" w:w="1234"/>
+          </w:tcPr>
+          <w:p>
+            <w:pPr>
+              <w:jc w:val="right"/>
+            </w:pPr>
+            <w:r>
+              <w:rPr>
+                <w:sz w:val="17"/>
+              </w:rPr>
+              <w:t>67 / 96</w:t>
+            </w:r>
+          </w:p>
+        </w:tc>
+        <w:tc>
+          <w:tcPr>
+            <w:tcW w:type="dxa" w:w="1234"/>
+          </w:tcPr>
+          <w:p>
+            <w:pPr>
+              <w:jc w:val="right"/>
+            </w:pPr>
+            <w:r>
+              <w:rPr>
+                <w:sz w:val="17"/>
+              </w:rPr>
+              <w:t>96 FP crops</w:t>
+            </w:r>
+          </w:p>
+        </w:tc>
+      </w:tr>
+    </w:tbl>
     <w:p>
       <w:r>
         <w:rPr>
@@ -3802,7 +5320,7 @@
           <w:i/>
           <w:sz w:val="17"/>
         </w:rPr>
-        <w:t>구성 B — 단어 검출기만 YOLOv5x 로 바꾼 것(간판 검출·인식기·VLM 동일): 연쇄 OCR recall 62.8% · TP 위 75.1% · GT crop 82.4%, 연쇄 태깅 recall 67.7% · TP 위 80.6%, 허위 POI 67/96. A(OCR recall 64.5%, 태깅 67.7%, 허위 POI 69/96)와의 차이는 1~2 pp 이내라 confidence interval 없이 차이로 읽지 않으며, 표 2 에서 두 word detector 가 구분되지 않은 것과 같은 결론입니다. 배포는 A 를 유지합니다. 정정: 이전 판의 연쇄 값(OCR 52.5%, 태깅 68.6%, 허위 POI 124/124)은 표 1 과 다른 검출기, 좌표를 오인해 잘못 잘린 크롭 9개, 표 3·4 와 다른 채점기, “unknown” 이 금지된 태깅으로 잰 값이라 대체합니다. 또 어느 fold 에도 속하지 않아 out-of-fold 검출이 없는 사진 2장(간판 10개)을 놓친 것으로 세던 것을 빼서, 표 1·2 와 같은 298장으로 맞췄습니다.</w:t>
+        <w:t>구성 A vs B — 차이는 OCR recall 1.7 pp(64.5 vs 62.8), 태깅 recall 0 pp(둘 다 67.7), 허위 POI 2건(69 vs 67)으로, confidence interval 없이 차이로 읽지 않습니다. 표 2 에서 두 word detector 가 구분되지 않은 것과 같은 결론이며, 배포는 A 를 유지합니다. 정정: 이전 판의 연쇄 값(OCR 52.5%, 태깅 68.6%, 허위 POI 124/124)은 표 1 과 다른 검출기, 좌표를 오인해 잘못 잘린 크롭 9개, 표 3·4 와 다른 채점기, “unknown” 이 금지된 태깅으로 잰 값이라 대체합니다. 또 어느 fold 에도 속하지 않아 out-of-fold 검출이 없는 사진 2장(간판 10개)을 놓친 것으로 세던 것을 빼서, 표 1·2 와 같은 298장으로 맞췄습니다.</w:t>
       </w:r>
     </w:p>
     <w:p>
@@ -3852,7 +5370,7 @@
           <w:i/>
           <w:sz w:val="17"/>
         </w:rPr>
-        <w:t>• 표 4 에는 confidence interval 을 계산하지 않았습니다. 1 pp 안팎의 차이(예: fix vs fixcand, Gemma vs Qwen)는 실제 차이로 취급하지 않습니다.</w:t>
+        <w:t>• 표 4·5 에는 confidence interval 을 계산하지 않았습니다. 1~2 pp 안팎의 차이(예: fix vs fixcand, Gemma vs Qwen, 구성 A vs B)는 실제 차이로 취급하지 않습니다.</w:t>
       </w:r>
     </w:p>
     <w:p>

</xml_diff>

<commit_message>
D43: EasyOCR and TrOCR-base trained on the same 75,612 word+line list
Same models and hyperparameters, only the training list changed (run 138 yeasywl,
run 139 ytrocrbwl, YOLO26x strips, Table 3 protocol):
  EasyOCR    51.0% / .251 / WAR .199  ->  56.2% / .230 / WAR .503
  TrOCR-base 58.4% / .258 / WAR .254  ->  65.5% / .198 / WAR .609
Held-out CI vs PaddleOCR: TrOCR -7.6 [-12.7, -2.2], EasyOCR -17.3 [-22.7, -12.3].
Tesseract stays word-only. Word tables (EN/KO) and the report updated.

Co-Authored-By: Claude Opus 5.5 <noreply@anthropic.com>
</commit_message>
<xml_diff>
--- a/docs/GSV_pipeline_report_20260928.docx
+++ b/docs/GSV_pipeline_report_20260928.docx
@@ -48,7 +48,7 @@
           <w:i/>
           <w:sz w:val="17"/>
         </w:rPr>
-        <w:t>③ OCR recognizer — SVTRv2-B 75.5% line exact. PaddleOCR 73.5% · PARSeq 68.6% 와는 held-out 95% CI 가 0 을 포함해 한 tier 이고, CLOVA 55.6% · Surya 42.4% · Tesseract 31.8% 는 유의하게 낮습니다. SVTRv2-B 를 배포로 고른 이유는 정확도가 아니라 비용(recognition pass 1회)입니다.</w:t>
+        <w:t>③ OCR recognizer — SVTRv2-B 75.5% line exact. PaddleOCR 73.5% · PARSeq 68.6% 와는 held-out 95% CI 가 0 을 포함해 한 tier 이고, TrOCR-base 65.5% · EasyOCR 56.2% · CLOVA 55.6% · Surya 42.4% · Tesseract 31.8% 는 유의하게 낮습니다. SVTRv2-B 를 배포로 고른 이유는 정확도가 아니라 비용(recognition pass 1회)입니다.</w:t>
       </w:r>
     </w:p>
     <w:p>
@@ -1055,7 +1055,7 @@
           <w:i/>
           <w:sz w:val="17"/>
         </w:rPr>
-        <w:t>PROTOCOL — 모든 행에서 고정한 것: word detector(YOLO26x @ conf 0.01), line merging(y_tol 0.04), strip padding(0.04), preprocessing, scoring 규칙(line matching, --mask-phone, Brooklyn 은 English-only 채점). 바꾼 것은 recognizer 하나뿐이고, 모든 행이 single model 입니다(ensemble 없음). 측정은 GSV GT signboard crop 411개 / 592 line. 각 지역 칸은 “line exact % / CER”입니다. 학습 데이터 — Training 열에 적은 대로 두 가지가 섞여 있습니다. PaddleOCR·PARSeq·SVTRv2-B 는 AI Hub signboard_v3 의 word crop 62,464 + real line crop 13,148 = 75,612 로 학습했고, EasyOCR·TrOCR-base·Tesseract 는 같은 split 의 word crop 만으로 학습했습니다. 평가 입력은 여러 단어가 든 line strip 이라, 이 세 행은 line 입력을 학습에서 보지 못한 조건입니다. WAR(word accuracy)가 이를 보여줍니다 — 이 세 행 0.20~0.29, line 을 학습한 세 행 0.67~0.69. 특히 EasyOCR·TrOCR 는 출력 line 에 공백이 한 번도 없고(0%, line 학습 행은 69~79%), line recall(CER&lt;1 인 line 비율)은 92~93% 로 line 학습 행(93~94%)과 비슷합니다 — 글자는 읽지만 줄 안에서 단어를 나누지 못합니다. Tesseract 는 공백은 내지만 line recall 이 67% 로 읽기 자체가 약합니다. 따라서 이 세 행과의 격차에는 구조 차이와 학습 데이터 차이가 섞여 있습니다. zero-shot 두 행(Surya, CLOVA)은 fine-tuning 이 불가능해서 zero-shot 인 것이며(Surya 는 학습 코드 미공개, CLOVA 는 상용 API), “학습 없이 그대로 쓰면 얼마인가”에 답하므로 fine-tuned 행과 한 순위표로 읽으면 안 됩니다. TrOCR-base 는 gradient clipping 1.0 · lr 2e-5 · warmup 500 · linear decay 로 학습했습니다(자체 test split exact 91.0%). ABINet 과 MAERec 은 공용 harness(OpenOCR)의 학습 코드 오류 2건으로 측정하지 못했습니다(“—”).</w:t>
+        <w:t>PROTOCOL — 모든 행에서 고정한 것: word detector(YOLO26x @ conf 0.01), line merging(y_tol 0.04), strip padding(0.04), preprocessing, scoring 규칙(line matching, --mask-phone, Brooklyn 은 English-only 채점). 바꾼 것은 recognizer 하나뿐이고, 모든 행이 single model 입니다(ensemble 없음). 측정은 GSV GT signboard crop 411개 / 592 line. 각 지역 칸은 “line exact % / CER”입니다. 학습 데이터 — fine-tuned 행 중 EasyOCR·TrOCR-base·PARSeq·PaddleOCR·SVTRv2-B 는 AI Hub signboard_v3 의 word crop 62,464 + real line crop 13,148 = 75,612 로 학습했고(val 9,609), Tesseract 는 같은 split 의 word crop 만으로 학습했습니다. 평가 입력은 여러 단어가 든 line strip 이라 Tesseract 행은 line 입력을 학습에서 보지 못한 조건이며, WAR(word accuracy)이 0.29 로 나머지 fine-tuned 행(0.50~0.69)보다 낮습니다. zero-shot 두 행(Surya, CLOVA)은 fine-tuning 이 불가능해서 zero-shot 인 것이며(Surya 는 학습 코드 미공개, CLOVA 는 상용 API), “학습 없이 그대로 쓰면 얼마인가”에 답하므로 fine-tuned 행과 한 순위표로 읽으면 안 됩니다. TrOCR-base 는 gradient clipping 1.0 · lr 2e-5 · warmup 500 · linear decay, 10 epoch 로 학습했습니다(자체 test split exact 91.1%). EasyOCR 은 VGG-BiLSTM-CTC, 50,000 iteration. ABINet 과 MAERec 은 공용 harness(OpenOCR)의 학습 코드 오류 2건으로 측정하지 못했습니다(“—”).</w:t>
       </w:r>
     </w:p>
     <w:tbl>
@@ -1571,7 +1571,7 @@
               <w:rPr>
                 <w:sz w:val="17"/>
               </w:rPr>
-              <w:t>fine-tuned (word crops only)</w:t>
+              <w:t>fine-tuned (words + lines)</w:t>
             </w:r>
           </w:p>
         </w:tc>
@@ -1587,7 +1587,7 @@
               <w:rPr>
                 <w:sz w:val="17"/>
               </w:rPr>
-              <w:t>54.2 / 0.276</w:t>
+              <w:t>56.6 / 0.259</w:t>
             </w:r>
           </w:p>
         </w:tc>
@@ -1603,7 +1603,7 @@
               <w:rPr>
                 <w:sz w:val="17"/>
               </w:rPr>
-              <w:t>46.7 / 0.208</w:t>
+              <w:t>56.8 / 0.184</w:t>
             </w:r>
           </w:p>
         </w:tc>
@@ -1619,7 +1619,7 @@
               <w:rPr>
                 <w:sz w:val="17"/>
               </w:rPr>
-              <w:t>51.9 / 0.316</w:t>
+              <w:t>55.2 / 0.298</w:t>
             </w:r>
           </w:p>
         </w:tc>
@@ -1635,7 +1635,7 @@
               <w:rPr>
                 <w:sz w:val="17"/>
               </w:rPr>
-              <w:t>51.0%</w:t>
+              <w:t>56.2%</w:t>
             </w:r>
           </w:p>
         </w:tc>
@@ -1651,7 +1651,7 @@
               <w:rPr>
                 <w:sz w:val="17"/>
               </w:rPr>
-              <w:t>0.251</w:t>
+              <w:t>0.230</w:t>
             </w:r>
           </w:p>
         </w:tc>
@@ -1714,7 +1714,7 @@
               <w:rPr>
                 <w:sz w:val="17"/>
               </w:rPr>
-              <w:t>fine-tuned (word crops only)</w:t>
+              <w:t>fine-tuned (words + lines)</w:t>
             </w:r>
           </w:p>
         </w:tc>
@@ -1730,7 +1730,7 @@
               <w:rPr>
                 <w:sz w:val="17"/>
               </w:rPr>
-              <w:t>64.6 / 0.251</w:t>
+              <w:t>71.2 / 0.228</w:t>
             </w:r>
           </w:p>
         </w:tc>
@@ -1746,7 +1746,7 @@
               <w:rPr>
                 <w:sz w:val="17"/>
               </w:rPr>
-              <w:t>46.2 / 0.262</w:t>
+              <w:t>56.8 / 0.168</w:t>
             </w:r>
           </w:p>
         </w:tc>
@@ -1762,7 +1762,7 @@
               <w:rPr>
                 <w:sz w:val="17"/>
               </w:rPr>
-              <w:t>64.6 / 0.258</w:t>
+              <w:t>68.5 / 0.228</w:t>
             </w:r>
           </w:p>
         </w:tc>
@@ -1778,7 +1778,7 @@
               <w:rPr>
                 <w:sz w:val="17"/>
               </w:rPr>
-              <w:t>58.4%</w:t>
+              <w:t>65.5%</w:t>
             </w:r>
           </w:p>
         </w:tc>
@@ -1794,7 +1794,7 @@
               <w:rPr>
                 <w:sz w:val="17"/>
               </w:rPr>
-              <w:t>0.258</w:t>
+              <w:t>0.198</w:t>
             </w:r>
           </w:p>
         </w:tc>
@@ -2816,7 +2816,7 @@
           <w:i/>
           <w:sz w:val="17"/>
         </w:rPr>
-        <w:t>이미 측정한 행들에 대한 held-out 검정입니다. OCR GT 가 있는 사진 277장을 사진 단위로 반으로 나누고(val 137 / test 140, 같은 간판이 양쪽에 걸리지 않게), test 절반(296 line)에서만 차이를 계산했습니다. crop 단위 paired percentile bootstrap, 2,000회 resampling 의 95% confidence interval 입니다. SVTRv2-B vs PaddleOCR +3.5 pp [-0.7, +7.9], PARSeq vs PaddleOCR -3.5 pp [-8.4, +1.0] — 둘 다 0 을 포함하므로 이 세 모델은 순위가 아니라 한 tier 입니다. 반면 CLOVA -13.8 pp [-19.6, -8.2], Surya -28.7 pp [-34.4, -23.1], Tesseract -39~-41 pp 는 구간이 0 을 지나지 않아 확실히 갈립니다. Tesseract 는 우리 word crop 으로 fine-tuning 해도 2.2 pp 밖에 움직이지 않았습니다. 주의할 점: 같은 비교를 더 약한 detector 위에서 돌리면 SVTRv2-B 가 PaddleOCR 를 유의하게 이기고 CLOVA 는 PaddleOCR 와 구분되지 않았습니다. 즉 recognizer 순위는 detector 에 따라 바뀌므로, 논문에 어느 detector 위에서 쟀는지를 반드시 명시해야 합니다.</w:t>
+        <w:t>이미 측정한 행들에 대한 held-out 검정입니다. OCR GT 가 있는 사진 277장을 사진 단위로 반으로 나누고(val 137 / test 140, 같은 간판이 양쪽에 걸리지 않게), test 절반(296 line)에서만 PaddleOCR 대비 차이를 계산했습니다. crop 단위 paired percentile bootstrap, 2,000회 resampling 의 95% confidence interval 입니다. SVTRv2-B +3.5 pp [-1.0, +7.9], PARSeq -3.5 pp [-8.2, +1.3] — 둘 다 0 을 포함하므로 이 세 모델은 순위가 아니라 한 tier 입니다. 반면 TrOCR-base -7.6 pp [-12.7, -2.2], CLOVA -13.8 pp [-19.6, -8.2], EasyOCR -17.3 pp [-22.7, -12.3], Surya -28.7 pp [-34.4, -23.1], Tesseract -39~-41 pp 는 구간이 0 을 지나지 않아 확실히 갈립니다. Tesseract 는 우리 word crop 으로 fine-tuning 해도 2.2 pp 밖에 움직이지 않았습니다. 주의할 점: 같은 비교를 더 약한 detector 위에서 돌리면 SVTRv2-B 가 PaddleOCR 를 유의하게 이기고 CLOVA 는 PaddleOCR 와 구분되지 않았습니다. 즉 recognizer 순위는 detector 에 따라 바뀌므로, 논문에 어느 detector 위에서 쟀는지를 반드시 명시해야 합니다.</w:t>
       </w:r>
     </w:p>
     <w:p/>
@@ -5360,7 +5360,7 @@
           <w:i/>
           <w:sz w:val="17"/>
         </w:rPr>
-        <w:t>• 표 3 의 zero-shot 행(Surya, CLOVA)과 fine-tuned 행은 서로 다른 질문에 답합니다. EasyOCR·TrOCR-base·Tesseract 는 word crop 만으로 학습해, 나머지 fine-tuned 행과의 격차에 학습 데이터 차이가 섞여 있습니다.</w:t>
+        <w:t>• 표 3 의 zero-shot 행(Surya, CLOVA)과 fine-tuned 행은 서로 다른 질문에 답합니다. Tesseract 의 fine-tuned 행만 word crop 으로 학습해, 다른 fine-tuned 행과의 격차에 학습 데이터 차이가 섞여 있습니다.</w:t>
       </w:r>
     </w:p>
     <w:p>

</xml_diff>